<commit_message>
Acronyme SRHVQ, pas à pas du site PréProd, analyse de la solution et du risque OneDrive
Co-Authored-By: Claude Opus 5.5 <noreply@anthropic.com>
Claude-Session: https://claude.ai/code/session_01FRdAzq8p3F9gJJe5MA3G79
</commit_message>
<xml_diff>
--- a/powerapps/preprod/GUIDE-PREPROD-ET-CONFORMITE.docx
+++ b/powerapps/preprod/GUIDE-PREPROD-ET-CONFORMITE.docx
@@ -31,7 +31,7 @@
         <w:t xml:space="preserve"> </w:t>
       </w:r>
       <w:r>
-        <w:t xml:space="preserve">(APCONT)</w:t>
+        <w:t xml:space="preserve">(SRHVQ)</w:t>
       </w:r>
       <w:r>
         <w:t xml:space="preserve"> </w:t>
@@ -686,6 +686,43 @@
         <w:t xml:space="preserve">Fichiers qui accompagnent ce guide :</w:t>
       </w:r>
     </w:p>
+    <w:p>
+      <w:pPr>
+        <w:pStyle w:val="BlockText"/>
+      </w:pPr>
+      <w:r>
+        <w:t xml:space="preserve">👉 Pour le site PréProd, suivez</w:t>
+      </w:r>
+      <w:r>
+        <w:t xml:space="preserve"> </w:t>
+      </w:r>
+      <w:r>
+        <w:rPr>
+          <w:bCs/>
+          <w:b/>
+        </w:rPr>
+        <w:t xml:space="preserve">SITE-PREPROD-PAS-A-PAS.docx</w:t>
+      </w:r>
+      <w:r>
+        <w:t xml:space="preserve"> </w:t>
+      </w:r>
+      <w:r>
+        <w:t xml:space="preserve">: la partie A ci-dessous y est détaillée clic par clic. Pour les références de connexion et OneDrive :</w:t>
+      </w:r>
+      <w:r>
+        <w:t xml:space="preserve"> </w:t>
+      </w:r>
+      <w:r>
+        <w:rPr>
+          <w:bCs/>
+          <w:b/>
+        </w:rPr>
+        <w:t xml:space="preserve">ANALYSE-SOLUTION-ET-ONEDRIVE.docx</w:t>
+      </w:r>
+      <w:r>
+        <w:t xml:space="preserve">.</w:t>
+      </w:r>
+    </w:p>
     <w:tbl>
       <w:tblPr>
         <w:tblStyle w:val="Table"/>
@@ -844,7 +881,7 @@
           <w:bCs/>
           <w:b/>
         </w:rPr>
-        <w:t xml:space="preserve">APCONT</w:t>
+        <w:t xml:space="preserve">SRHVQ</w:t>
       </w:r>
       <w:r>
         <w:t xml:space="preserve">. Acronyme du service :</w:t>
@@ -931,7 +968,7 @@
                 <w:bCs/>
                 <w:b/>
               </w:rPr>
-              <w:t xml:space="preserve">APCONT_SiteWeb-RHSST-AppreciationContribution</w:t>
+              <w:t xml:space="preserve">SRHVQ_SiteWeb-RHSST-AppreciationContribution</w:t>
             </w:r>
           </w:p>
         </w:tc>
@@ -961,7 +998,7 @@
                 <w:bCs/>
                 <w:b/>
               </w:rPr>
-              <w:t xml:space="preserve">APCONT_Appreciations</w:t>
+              <w:t xml:space="preserve">SRHVQ_Appreciations</w:t>
             </w:r>
           </w:p>
         </w:tc>
@@ -991,7 +1028,7 @@
                 <w:bCs/>
                 <w:b/>
               </w:rPr>
-              <w:t xml:space="preserve">APCONT_Parametres</w:t>
+              <w:t xml:space="preserve">SRHVQ_Parametres</w:t>
             </w:r>
           </w:p>
         </w:tc>
@@ -1021,7 +1058,7 @@
                 <w:bCs/>
                 <w:b/>
               </w:rPr>
-              <w:t xml:space="preserve">APCONT_CourrielPaie</w:t>
+              <w:t xml:space="preserve">SRHVQ_CourrielPaie</w:t>
             </w:r>
           </w:p>
         </w:tc>
@@ -1051,7 +1088,7 @@
                 <w:bCs/>
                 <w:b/>
               </w:rPr>
-              <w:t xml:space="preserve">APCONT_LienApplication</w:t>
+              <w:t xml:space="preserve">SRHVQ_LienApplication</w:t>
             </w:r>
           </w:p>
         </w:tc>
@@ -1091,7 +1128,7 @@
                 <w:bCs/>
                 <w:b/>
               </w:rPr>
-              <w:t xml:space="preserve">APCONT_CourrielSoutien</w:t>
+              <w:t xml:space="preserve">SRHVQ_CourrielSoutien</w:t>
             </w:r>
           </w:p>
         </w:tc>
@@ -1121,7 +1158,7 @@
                 <w:bCs/>
                 <w:b/>
               </w:rPr>
-              <w:t xml:space="preserve">APCONT_Appreciations</w:t>
+              <w:t xml:space="preserve">SRHVQ_Appreciations</w:t>
             </w:r>
           </w:p>
         </w:tc>
@@ -1151,7 +1188,7 @@
                 <w:bCs/>
                 <w:b/>
               </w:rPr>
-              <w:t xml:space="preserve">APCONT_Parametres</w:t>
+              <w:t xml:space="preserve">SRHVQ_Parametres</w:t>
             </w:r>
           </w:p>
         </w:tc>
@@ -1181,7 +1218,7 @@
                 <w:bCs/>
                 <w:b/>
               </w:rPr>
-              <w:t xml:space="preserve">APCONT_Utilisateurs</w:t>
+              <w:t xml:space="preserve">SRHVQ_Utilisateurs</w:t>
             </w:r>
             <w:r>
               <w:t xml:space="preserve"> </w:t>
@@ -1233,7 +1270,7 @@
                 <w:bCs/>
                 <w:b/>
               </w:rPr>
-              <w:t xml:space="preserve">APCONT_RH</w:t>
+              <w:t xml:space="preserve">SRHVQ_RH</w:t>
             </w:r>
           </w:p>
         </w:tc>
@@ -1596,7 +1633,7 @@
           <w:bCs/>
           <w:b/>
         </w:rPr>
-        <w:t xml:space="preserve">APCONT_Utilisateurs</w:t>
+        <w:t xml:space="preserve">SRHVQ_Utilisateurs</w:t>
       </w:r>
       <w:r>
         <w:t xml:space="preserve">. Description : « Utilisateurs de l’application Appréciation de la contribution ».</w:t>
@@ -1747,7 +1784,7 @@
           <w:bCs/>
           <w:b/>
         </w:rPr>
-        <w:t xml:space="preserve">APCONT_RH</w:t>
+        <w:t xml:space="preserve">SRHVQ_RH</w:t>
       </w:r>
       <w:r>
         <w:t xml:space="preserve">. Ajoutez-y les personnes des RH autorisées à consulter</w:t>
@@ -1978,7 +2015,7 @@
           <w:bCs/>
           <w:b/>
         </w:rPr>
-        <w:t xml:space="preserve">APCONT_Appreciations</w:t>
+        <w:t xml:space="preserve">SRHVQ_Appreciations</w:t>
       </w:r>
       <w:r>
         <w:t xml:space="preserve">. Description : « Dossiers de l’application Appréciation de la contribution ».</w:t>
@@ -2032,7 +2069,7 @@
           <w:bCs/>
           <w:b/>
         </w:rPr>
-        <w:t xml:space="preserve">APCONT_Parametres</w:t>
+        <w:t xml:space="preserve">SRHVQ_Parametres</w:t>
       </w:r>
       <w:r>
         <w:t xml:space="preserve">.</w:t>
@@ -2047,7 +2084,7 @@
           <w:bCs/>
           <w:b/>
         </w:rPr>
-        <w:t xml:space="preserve">Vérifiez les réglages de APCONT_Appreciations</w:t>
+        <w:t xml:space="preserve">Vérifiez les réglages de SRHVQ_Appreciations</w:t>
       </w:r>
       <w:r>
         <w:t xml:space="preserve"> </w:t>
@@ -2372,7 +2409,7 @@
           <w:bCs/>
           <w:b/>
         </w:rPr>
-        <w:t xml:space="preserve">Remplissez APCONT_Parametres</w:t>
+        <w:t xml:space="preserve">Remplissez SRHVQ_Parametres</w:t>
       </w:r>
       <w:r>
         <w:t xml:space="preserve"> </w:t>
@@ -2611,7 +2648,7 @@
           <w:bCs/>
           <w:b/>
         </w:rPr>
-        <w:t xml:space="preserve">APCONT_Appreciations :</w:t>
+        <w:t xml:space="preserve">SRHVQ_Appreciations :</w:t>
       </w:r>
     </w:p>
     <w:p>
@@ -2798,7 +2835,7 @@
           <w:bCs/>
           <w:b/>
         </w:rPr>
-        <w:t xml:space="preserve">APCONT_Utilisateurs</w:t>
+        <w:t xml:space="preserve">SRHVQ_Utilisateurs</w:t>
       </w:r>
       <w:r>
         <w:t xml:space="preserve">, niveau</w:t>
@@ -2859,7 +2896,7 @@
           <w:bCs/>
           <w:b/>
         </w:rPr>
-        <w:t xml:space="preserve">APCONT_RH</w:t>
+        <w:t xml:space="preserve">SRHVQ_RH</w:t>
       </w:r>
       <w:r>
         <w:t xml:space="preserve">, niveau</w:t>
@@ -2925,7 +2962,7 @@
           <w:bCs/>
           <w:b/>
         </w:rPr>
-        <w:t xml:space="preserve">APCONT_Utilisateurs</w:t>
+        <w:t xml:space="preserve">SRHVQ_Utilisateurs</w:t>
       </w:r>
       <w:r>
         <w:t xml:space="preserve"> </w:t>
@@ -2941,7 +2978,7 @@
           <w:bCs/>
           <w:b/>
         </w:rPr>
-        <w:t xml:space="preserve">APCONT_RH</w:t>
+        <w:t xml:space="preserve">SRHVQ_RH</w:t>
       </w:r>
       <w:r>
         <w:t xml:space="preserve"> </w:t>
@@ -2959,7 +2996,7 @@
           <w:bCs/>
           <w:b/>
         </w:rPr>
-        <w:t xml:space="preserve">APCONT_Parametres :</w:t>
+        <w:t xml:space="preserve">SRHVQ_Parametres :</w:t>
       </w:r>
       <w:r>
         <w:t xml:space="preserve"> </w:t>
@@ -2975,7 +3012,7 @@
           <w:bCs/>
           <w:b/>
         </w:rPr>
-        <w:t xml:space="preserve">APCONT_Utilisateurs</w:t>
+        <w:t xml:space="preserve">SRHVQ_Utilisateurs</w:t>
       </w:r>
       <w:r>
         <w:t xml:space="preserve"> </w:t>
@@ -2991,7 +3028,7 @@
           <w:bCs/>
           <w:b/>
         </w:rPr>
-        <w:t xml:space="preserve">APCONT_RH</w:t>
+        <w:t xml:space="preserve">SRHVQ_RH</w:t>
       </w:r>
       <w:r>
         <w:t xml:space="preserve"> </w:t>
@@ -3021,7 +3058,7 @@
         <w:pStyle w:val="BlockText"/>
       </w:pPr>
       <w:r>
-        <w:t xml:space="preserve">💡 Pourquoi Collaboration sur APCONT_Appreciations ? Chaque personne doit pouvoir</w:t>
+        <w:t xml:space="preserve">💡 Pourquoi Collaboration sur SRHVQ_Appreciations ? Chaque personne doit pouvoir</w:t>
       </w:r>
       <w:r>
         <w:t xml:space="preserve"> </w:t>
@@ -3047,7 +3084,7 @@
           <w:bCs/>
           <w:b/>
         </w:rPr>
-        <w:t xml:space="preserve">APCONT_Utilisateurs</w:t>
+        <w:t xml:space="preserve">SRHVQ_Utilisateurs</w:t>
       </w:r>
       <w:r>
         <w:t xml:space="preserve"> </w:t>
@@ -3115,7 +3152,7 @@
               <w:jc w:val="left"/>
             </w:pPr>
             <w:r>
-              <w:t xml:space="preserve">APCONT_SiteWeb-RHSST-AppreciationContribution</w:t>
+              <w:t xml:space="preserve">SRHVQ_SiteWeb-RHSST-AppreciationContribution</w:t>
             </w:r>
           </w:p>
         </w:tc>
@@ -3161,7 +3198,7 @@
               <w:jc w:val="left"/>
             </w:pPr>
             <w:r>
-              <w:t xml:space="preserve">APCONT_Appreciations</w:t>
+              <w:t xml:space="preserve">SRHVQ_Appreciations</w:t>
             </w:r>
           </w:p>
         </w:tc>
@@ -3183,7 +3220,7 @@
                 <w:bCs/>
                 <w:b/>
               </w:rPr>
-              <w:t xml:space="preserve">APCONT_Appreciations</w:t>
+              <w:t xml:space="preserve">SRHVQ_Appreciations</w:t>
             </w:r>
           </w:p>
         </w:tc>
@@ -3197,7 +3234,7 @@
               <w:jc w:val="left"/>
             </w:pPr>
             <w:r>
-              <w:t xml:space="preserve">APCONT_Parametres</w:t>
+              <w:t xml:space="preserve">SRHVQ_Parametres</w:t>
             </w:r>
           </w:p>
         </w:tc>
@@ -3219,7 +3256,7 @@
                 <w:bCs/>
                 <w:b/>
               </w:rPr>
-              <w:t xml:space="preserve">APCONT_Parametres</w:t>
+              <w:t xml:space="preserve">SRHVQ_Parametres</w:t>
             </w:r>
           </w:p>
         </w:tc>
@@ -3233,7 +3270,7 @@
               <w:jc w:val="left"/>
             </w:pPr>
             <w:r>
-              <w:t xml:space="preserve">APCONT_CourrielPaie</w:t>
+              <w:t xml:space="preserve">SRHVQ_CourrielPaie</w:t>
             </w:r>
           </w:p>
         </w:tc>
@@ -3259,7 +3296,7 @@
               <w:jc w:val="left"/>
             </w:pPr>
             <w:r>
-              <w:t xml:space="preserve">APCONT_LienApplication</w:t>
+              <w:t xml:space="preserve">SRHVQ_LienApplication</w:t>
             </w:r>
           </w:p>
         </w:tc>
@@ -3285,7 +3322,7 @@
               <w:jc w:val="left"/>
             </w:pPr>
             <w:r>
-              <w:t xml:space="preserve">APCONT_CourrielSoutien</w:t>
+              <w:t xml:space="preserve">SRHVQ_CourrielSoutien</w:t>
             </w:r>
           </w:p>
         </w:tc>
@@ -3342,13 +3379,13 @@
         <w:t xml:space="preserve">Partie B — La solution dans le bac à sable</w:t>
       </w:r>
     </w:p>
-    <w:bookmarkStart w:id="28" w:name="X397c8052d71ac43c34d10b5795a4e480aafbb68"/>
+    <w:bookmarkStart w:id="28" w:name="X650f18fee0efc5ebe94218b2ef6ea2f51944fae"/>
     <w:p>
       <w:pPr>
         <w:pStyle w:val="Heading2"/>
       </w:pPr>
       <w:r>
-        <w:t xml:space="preserve">B1. Créer le groupe APCONT_Utilisateurs dans le bac à sable aussi</w:t>
+        <w:t xml:space="preserve">B1. Créer le groupe SRHVQ_Utilisateurs dans le bac à sable aussi</w:t>
       </w:r>
     </w:p>
     <w:p>
@@ -3366,7 +3403,7 @@
           <w:bCs/>
           <w:b/>
         </w:rPr>
-        <w:t xml:space="preserve">APCONT_Utilisateurs</w:t>
+        <w:t xml:space="preserve">SRHVQ_Utilisateurs</w:t>
       </w:r>
       <w:r>
         <w:t xml:space="preserve"> </w:t>
@@ -3423,7 +3460,7 @@
           <w:bCs/>
           <w:b/>
         </w:rPr>
-        <w:t xml:space="preserve">APCONT_Utilisateurs</w:t>
+        <w:t xml:space="preserve">SRHVQ_Utilisateurs</w:t>
       </w:r>
       <w:r>
         <w:t xml:space="preserve"> </w:t>
@@ -3473,7 +3510,7 @@
         <w:t xml:space="preserve"> </w:t>
       </w:r>
       <w:r>
-        <w:t xml:space="preserve">: retirez Membres et Visiteurs, puis ajoutez APCONT_Utilisateurs (Collaboration) et RH – Appréciations (Lecture).</w:t>
+        <w:t xml:space="preserve">: retirez Membres et Visiteurs, puis ajoutez SRHVQ_Utilisateurs (Collaboration) et RH – Appréciations (Lecture).</w:t>
       </w:r>
     </w:p>
     <w:p>
@@ -3679,7 +3716,7 @@
               <w:jc w:val="left"/>
             </w:pPr>
             <w:r>
-              <w:t xml:space="preserve">APCONT_SiteWeb-RHSST-AppreciationContribution</w:t>
+              <w:t xml:space="preserve">SRHVQ_SiteWeb-RHSST-AppreciationContribution</w:t>
             </w:r>
           </w:p>
         </w:tc>
@@ -3717,7 +3754,7 @@
               <w:jc w:val="left"/>
             </w:pPr>
             <w:r>
-              <w:t xml:space="preserve">APCONT_Appreciations</w:t>
+              <w:t xml:space="preserve">SRHVQ_Appreciations</w:t>
             </w:r>
           </w:p>
         </w:tc>
@@ -3755,7 +3792,7 @@
               <w:jc w:val="left"/>
             </w:pPr>
             <w:r>
-              <w:t xml:space="preserve">APCONT_Parametres</w:t>
+              <w:t xml:space="preserve">SRHVQ_Parametres</w:t>
             </w:r>
           </w:p>
         </w:tc>
@@ -3793,7 +3830,7 @@
               <w:jc w:val="left"/>
             </w:pPr>
             <w:r>
-              <w:t xml:space="preserve">APCONT_CourrielPaie</w:t>
+              <w:t xml:space="preserve">SRHVQ_CourrielPaie</w:t>
             </w:r>
           </w:p>
         </w:tc>
@@ -3831,7 +3868,7 @@
               <w:jc w:val="left"/>
             </w:pPr>
             <w:r>
-              <w:t xml:space="preserve">APCONT_LienApplication</w:t>
+              <w:t xml:space="preserve">SRHVQ_LienApplication</w:t>
             </w:r>
           </w:p>
         </w:tc>
@@ -3897,7 +3934,7 @@
           <w:bCs/>
           <w:b/>
         </w:rPr>
-        <w:t xml:space="preserve">APCONT_CourrielSoutien</w:t>
+        <w:t xml:space="preserve">SRHVQ_CourrielSoutien</w:t>
       </w:r>
       <w:r>
         <w:t xml:space="preserve"> </w:t>
@@ -4238,7 +4275,7 @@
         <w:t xml:space="preserve"> </w:t>
       </w:r>
       <w:r>
-        <w:t xml:space="preserve">(ex. APCONT_Appreciations).</w:t>
+        <w:t xml:space="preserve">(ex. SRHVQ_Appreciations).</w:t>
       </w:r>
     </w:p>
     <w:p>
@@ -4430,13 +4467,13 @@
       </w:tr>
     </w:tbl>
     <w:bookmarkEnd w:id="31"/>
-    <w:bookmarkStart w:id="32" w:name="X1a00b2a7eb4e06ebc0e6539337cb29da445d38e"/>
+    <w:bookmarkStart w:id="32" w:name="X970f71fc92c8f1047c263d155495f6ec7f70e45"/>
     <w:p>
       <w:pPr>
         <w:pStyle w:val="Heading2"/>
       </w:pPr>
       <w:r>
-        <w:t xml:space="preserve">B5. Flux 1 : retirer le groupe APCONT_Utilisateurs (au lieu des Membres)</w:t>
+        <w:t xml:space="preserve">B5. Flux 1 : retirer le groupe SRHVQ_Utilisateurs (au lieu des Membres)</w:t>
       </w:r>
     </w:p>
     <w:p>
@@ -4500,7 +4537,7 @@
         <w:rPr>
           <w:rStyle w:val="VerbatimChar"/>
         </w:rPr>
-        <w:t xml:space="preserve">_api/web/sitegroups/getbyname('APCONT_Utilisateurs')?$select=Id</w:t>
+        <w:t xml:space="preserve">_api/web/sitegroups/getbyname('SRHVQ_Utilisateurs')?$select=Id</w:t>
       </w:r>
     </w:p>
     <w:p>
@@ -4508,7 +4545,7 @@
         <w:pStyle w:val="FirstParagraph"/>
       </w:pPr>
       <w:r>
-        <w:t xml:space="preserve">L’action 4 « Retirer les Membres » n’a pas à changer : elle retire maintenant APCONT_Utilisateurs du dossier.</w:t>
+        <w:t xml:space="preserve">L’action 4 « Retirer les Membres » n’a pas à changer : elle retire maintenant SRHVQ_Utilisateurs du dossier.</w:t>
       </w:r>
     </w:p>
     <w:bookmarkEnd w:id="32"/>
@@ -4786,7 +4823,7 @@
           <w:bCs/>
           <w:b/>
         </w:rPr>
-        <w:t xml:space="preserve">APCONT_CourrielSoutien</w:t>
+        <w:t xml:space="preserve">SRHVQ_CourrielSoutien</w:t>
       </w:r>
       <w:r>
         <w:t xml:space="preserve"> </w:t>
@@ -6081,7 +6118,7 @@
           <w:bCs/>
           <w:b/>
         </w:rPr>
-        <w:t xml:space="preserve">APCONT_Parametres</w:t>
+        <w:t xml:space="preserve">SRHVQ_Parametres</w:t>
       </w:r>
       <w:r>
         <w:t xml:space="preserve">. On les change sans republier l’application.</w:t>
@@ -6691,7 +6728,7 @@
           <w:bCs/>
           <w:b/>
         </w:rPr>
-        <w:t xml:space="preserve">APCONT_Revision-versions</w:t>
+        <w:t xml:space="preserve">SRHVQ_Revision-versions</w:t>
       </w:r>
       <w:r>
         <w:t xml:space="preserve"> </w:t>
@@ -6799,7 +6836,7 @@
                 <w:bCs/>
                 <w:b/>
               </w:rPr>
-              <w:t xml:space="preserve">APCONT_Matrice-securite.xlsx</w:t>
+              <w:t xml:space="preserve">SRHVQ_Matrice-securite.xlsx</w:t>
             </w:r>
           </w:p>
         </w:tc>
@@ -6829,7 +6866,7 @@
                 <w:bCs/>
                 <w:b/>
               </w:rPr>
-              <w:t xml:space="preserve">APCONT_Matrice-metadonnees.xlsx</w:t>
+              <w:t xml:space="preserve">SRHVQ_Matrice-metadonnees.xlsx</w:t>
             </w:r>
           </w:p>
         </w:tc>
@@ -6859,7 +6896,7 @@
                 <w:bCs/>
                 <w:b/>
               </w:rPr>
-              <w:t xml:space="preserve">APCONT_Architecture-application.docx</w:t>
+              <w:t xml:space="preserve">SRHVQ_Architecture-application.docx</w:t>
             </w:r>
           </w:p>
         </w:tc>
@@ -6895,7 +6932,7 @@
                 <w:bCs/>
                 <w:b/>
               </w:rPr>
-              <w:t xml:space="preserve">APCONT_Architecture-application.docx</w:t>
+              <w:t xml:space="preserve">SRHVQ_Architecture-application.docx</w:t>
             </w:r>
             <w:r>
               <w:t xml:space="preserve">, partie 4</w:t>
@@ -6928,7 +6965,7 @@
                 <w:bCs/>
                 <w:b/>
               </w:rPr>
-              <w:t xml:space="preserve">APCONT_Liste-utilisateurs.xlsx</w:t>
+              <w:t xml:space="preserve">SRHVQ_Liste-utilisateurs.xlsx</w:t>
             </w:r>
           </w:p>
         </w:tc>
@@ -6958,7 +6995,7 @@
                 <w:bCs/>
                 <w:b/>
               </w:rPr>
-              <w:t xml:space="preserve">APCONT_Revision-versions.docx</w:t>
+              <w:t xml:space="preserve">SRHVQ_Revision-versions.docx</w:t>
             </w:r>
           </w:p>
         </w:tc>
@@ -7329,7 +7366,7 @@
               <w:jc w:val="left"/>
             </w:pPr>
             <w:r>
-              <w:t xml:space="preserve">Propriétaires, APCONT_RH, personnes du dossier.</w:t>
+              <w:t xml:space="preserve">Propriétaires, SRHVQ_RH, personnes du dossier.</w:t>
             </w:r>
             <w:r>
               <w:t xml:space="preserve"> </w:t>
@@ -7345,7 +7382,7 @@
               <w:t xml:space="preserve"> </w:t>
             </w:r>
             <w:r>
-              <w:t xml:space="preserve">APCONT_Utilisateurs</w:t>
+              <w:t xml:space="preserve">SRHVQ_Utilisateurs</w:t>
             </w:r>
           </w:p>
         </w:tc>
@@ -7807,7 +7844,7 @@
               <w:jc w:val="left"/>
             </w:pPr>
             <w:r>
-              <w:t xml:space="preserve">Listes APCONT</w:t>
+              <w:t xml:space="preserve">Listes SRHVQ</w:t>
             </w:r>
           </w:p>
         </w:tc>
@@ -7887,7 +7924,7 @@
               <w:jc w:val="left"/>
             </w:pPr>
             <w:r>
-              <w:t xml:space="preserve">APCONT_Appreciations, APCONT_Parametres</w:t>
+              <w:t xml:space="preserve">SRHVQ_Appreciations, SRHVQ_Parametres</w:t>
             </w:r>
           </w:p>
         </w:tc>
@@ -7935,7 +7972,7 @@
               <w:jc w:val="left"/>
             </w:pPr>
             <w:r>
-              <w:t xml:space="preserve">APCONT_Appreciations, APCONT_Parametres</w:t>
+              <w:t xml:space="preserve">SRHVQ_Appreciations, SRHVQ_Parametres</w:t>
             </w:r>
           </w:p>
         </w:tc>
@@ -7975,7 +8012,7 @@
         <w:t xml:space="preserve"> </w:t>
       </w:r>
       <w:r>
-        <w:t xml:space="preserve">et qu’on ne donne accès qu’aux groupes de l’application (APCONT_Utilisateurs, APCONT_RH). Les Membres et Visiteurs du site, qui peuvent appartenir à d’autres applications, sont retirés de nos listes.</w:t>
+        <w:t xml:space="preserve">et qu’on ne donne accès qu’aux groupes de l’application (SRHVQ_Utilisateurs, SRHVQ_RH). Les Membres et Visiteurs du site, qui peuvent appartenir à d’autres applications, sont retirés de nos listes.</w:t>
       </w:r>
     </w:p>
     <w:p>
@@ -8028,7 +8065,7 @@
         <w:t xml:space="preserve"> </w:t>
       </w:r>
       <w:r>
-        <w:t xml:space="preserve">dans APCONT_Utilisateurs ;</w:t>
+        <w:t xml:space="preserve">dans SRHVQ_Utilisateurs ;</w:t>
       </w:r>
       <w:r>
         <w:t xml:space="preserve"> </w:t>
@@ -8050,7 +8087,7 @@
         <w:t xml:space="preserve"> </w:t>
       </w:r>
       <w:r>
-        <w:t xml:space="preserve">dans APCONT_Parametres.</w:t>
+        <w:t xml:space="preserve">dans SRHVQ_Parametres.</w:t>
       </w:r>
     </w:p>
     <w:p>

</xml_diff>